<commit_message>
Proposta de acordo no padrão do escritório e qualificação das partes conforme os autos
Co-Authored-By: Claude Opus 5.5 <noreply@anthropic.com>
Claude-Session: https://claude.ai/code/session_019G44zYPhJLJntoZFXVaaCM
</commit_message>
<xml_diff>
--- a/0801581-45.2026 - Cicero da Silva/Termo de acordo - Cicero da Silva.docx
+++ b/0801581-45.2026 - Cicero da Silva/Termo de acordo - Cicero da Silva.docx
@@ -120,15 +120,15 @@
           <w:sz w:val="24"/>
           <w:szCs w:val="24"/>
         </w:rPr>
-        <w:t xml:space="preserve">CREDOR: ITAÚ UNIBANCO HOLDING S.A.</w:t>
-      </w:r>
-      <w:r>
-        <w:rPr>
-          <w:rFonts w:ascii="Lora" w:cs="Lora" w:eastAsia="Lora" w:hAnsi="Lora"/>
-          <w:sz w:val="24"/>
-          <w:szCs w:val="24"/>
-        </w:rPr>
-        <w:t xml:space="preserve">, instituição financeira inscrita no CNPJ sob o nº 60.872.504/0001-23, com sede na Praça Alfredo Egydio de Souza Aranha, nº 100, Torre Olavo Setubal, Parque Jabaquara, São Paulo/SP, CEP 04344-902, por si e na qualidade de sucessor do BANCO ITAUCARD S.A. (CNPJ nº 17.192.451/0001-70), neste ato representado por seu advogado, JOSÉ CARLOS SKRZYSZOWSKI JUNIOR, inscrito na OAB/PI sob o nº 9.431, com poderes para transigir; e</w:t>
+        <w:t xml:space="preserve">CREDOR: BANCO ITAÚ UNIBANCO HOLDING S/A</w:t>
+      </w:r>
+      <w:r>
+        <w:rPr>
+          <w:rFonts w:ascii="Lora" w:cs="Lora" w:eastAsia="Lora" w:hAnsi="Lora"/>
+          <w:sz w:val="24"/>
+          <w:szCs w:val="24"/>
+        </w:rPr>
+        <w:t xml:space="preserve">, instituição financeira, inscrita no CNPJ sob o nº 60.872.504/0001-23, com sede na Praça Alfredo Egydio de Souza Aranha, 100, Torre Olavo Setubal, piso Itaú Unibanco, Parque Jabaquara, São Paulo/SP, CEP 04344-902, sucessora do Banco Itaucard S.A., neste ato representada por seu advogado, JOSÉ CARLOS SKRZYSZOWSKI JUNIOR, inscrito na OAB/PI sob o nº 9.431, com poderes para transigir; e</w:t>
       </w:r>
     </w:p>
     <w:p>
@@ -153,7 +153,7 @@
           <w:sz w:val="24"/>
           <w:szCs w:val="24"/>
         </w:rPr>
-        <w:t xml:space="preserve">, inscrito no CPF sob o nº 053.884.853-74, residente e domiciliado em Mata Fria, s/n, Casa, Bairro Matadouro, Miguel Alves/PI, CEP 64.130-000, neste ato assistido por seu advogado, ANTÔNIO DE PÁDUA SANTOS NETO, inscrito na OAB/PI sob o nº 21.320;</w:t>
+        <w:t xml:space="preserve">, inscrito no CPF sob o nº 053.884.853-74, com endereço na Mata Fria, SN, Casa, Matadouro, Miguel Alves/PI, CEP 64130-000, neste ato assistido por seu advogado, ANTÔNIO DE PÁDUA SANTOS NETO, inscrito na OAB/PI sob o nº 21.320;</w:t>
       </w:r>
     </w:p>
     <w:p>

</xml_diff>